<commit_message>
Guide: reuse original screenshots, match any PDF in 060 folder
Co-Authored-By: Claude Sonnet 5.5 <noreply@anthropic.com>
Claude-Session: https://claude.ai/code/session_016ei7KnhVLw4EkL39seQKhk
</commit_message>
<xml_diff>
--- a/FAG_Artikel_Zeichnungslinks_Anleitung_mit_Screenshots.docx
+++ b/FAG_Artikel_Zeichnungslinks_Anleitung_mit_Screenshots.docx
@@ -47,7 +47,7 @@
         <w:t xml:space="preserve">Wie findet Excel die Zeichnung? </w:t>
       </w:r>
       <w:r>
-        <w:t xml:space="preserve">Excel sucht im SharePoint-Ordner 030_Completed_Project (ggf. mit Unterordner 00_STS_Turnaround) den Ordner, der mit den ersten 7 Stellen der Artikelnummer beginnt. Darin nimmt es im Ordner 060_Zeichnungen die PDF, deren Name auf „z0.pdf“ endet.</w:t>
+        <w:t xml:space="preserve">Excel sucht im SharePoint-Ordner 030_Completed_Project (ggf. mit Unterordner 00_STS_Turnaround) den Ordner, der mit den ersten 7 Stellen der Artikelnummer beginnt. Darin nimmt es im Ordner 060_Zeichnungen die PDF. Der Dateiname ist egal, es zählt nur, dass es eine PDF ist.</w:t>
       </w:r>
     </w:p>
     <w:p>
@@ -232,7 +232,7 @@
                 <w:sz w:val="20"/>
                 <w:szCs w:val="20"/>
               </w:rPr>
-              <w:t xml:space="preserve">Beispiel-Ordnerpfad: 030_Completed_Project → 00_STS_Turnaround → Artikelordner → 060_Zeichnungen mit der PDF (Name endet auf z0.pdf)</w:t>
+              <w:t xml:space="preserve">Beispiel-Ordnerpfad: 030_Completed_Project → 00_STS_Turnaround → Artikelordner → 060_Zeichnungen mit der PDF</w:t>
             </w:r>
           </w:p>
         </w:tc>
@@ -908,6 +908,85 @@
         <w:t xml:space="preserve">.</w:t>
       </w:r>
     </w:p>
+    <w:p>
+      <w:pPr>
+        <w:spacing w:after="160" w:before="80"/>
+        <w:jc w:val="center"/>
+      </w:pPr>
+      <w:r>
+        <w:drawing>
+          <wp:inline distT="0" distB="0" distL="0" distR="0">
+            <wp:extent cx="3619500" cy="2543175"/>
+            <wp:effectExtent t="0" r="0" b="0" l="0"/>
+            <wp:docPr id="1" name="image1.png" descr="image1.png" title="image1.png"/>
+            <wp:cNvGraphicFramePr>
+              <a:graphicFrameLocks xmlns:a="http://schemas.openxmlformats.org/drawingml/2006/main" noChangeAspect="1"/>
+            </wp:cNvGraphicFramePr>
+            <a:graphic xmlns:a="http://schemas.openxmlformats.org/drawingml/2006/main">
+              <a:graphicData uri="http://schemas.openxmlformats.org/drawingml/2006/picture">
+                <pic:pic xmlns:pic="http://schemas.openxmlformats.org/drawingml/2006/picture">
+                  <pic:nvPicPr>
+                    <pic:cNvPr id="0" name="" descr=""/>
+                    <pic:cNvPicPr>
+                      <a:picLocks noChangeAspect="1" noChangeArrowheads="1"/>
+                    </pic:cNvPicPr>
+                  </pic:nvPicPr>
+                  <pic:blipFill>
+                    <a:blip r:embed="rId7" cstate="none"/>
+                    <a:srcRect/>
+                    <a:stretch>
+                      <a:fillRect/>
+                    </a:stretch>
+                  </pic:blipFill>
+                  <pic:spPr bwMode="auto">
+                    <a:xfrm>
+                      <a:off x="0" y="0"/>
+                      <a:ext cx="3619500" cy="2543175"/>
+                    </a:xfrm>
+                    <a:prstGeom prst="rect">
+                      <a:avLst/>
+                    </a:prstGeom>
+                  </pic:spPr>
+                </pic:pic>
+              </a:graphicData>
+            </a:graphic>
+          </wp:inline>
+        </w:drawing>
+      </w:r>
+    </w:p>
+    <w:p>
+      <w:pPr>
+        <w:pStyle w:val="ListParagraph"/>
+        <w:numPr>
+          <w:ilvl w:val="0"/>
+          <w:numId w:val="4"/>
+        </w:numPr>
+        <w:spacing w:after="80"/>
+      </w:pPr>
+      <w:r>
+        <w:t xml:space="preserve">Im Editor steht schon Text (z. B. „let Source = …“). </w:t>
+      </w:r>
+      <w:r>
+        <w:rPr>
+          <w:b/>
+          <w:bCs/>
+        </w:rPr>
+        <w:t xml:space="preserve">Lösche ihn komplett</w:t>
+      </w:r>
+      <w:r>
+        <w:t xml:space="preserve"> (Strg+A, Entf) und füge dann Code 1 aus dem Anhang ein (Strg+V). Klicke auf </w:t>
+      </w:r>
+      <w:r>
+        <w:rPr>
+          <w:b/>
+          <w:bCs/>
+        </w:rPr>
+        <w:t xml:space="preserve">Fertig</w:t>
+      </w:r>
+      <w:r>
+        <w:t xml:space="preserve">.</w:t>
+      </w:r>
+    </w:p>
     <w:tbl>
       <w:tblPr>
         <w:tblW w:type="dxa" w:w="9638"/>
@@ -968,7 +1047,66 @@
                 <w:sz w:val="20"/>
                 <w:szCs w:val="20"/>
               </w:rPr>
-              <w:t xml:space="preserve">Reiter „Start“, Schaltfläche „Erweiterter Editor“ (rot umkreisen)</w:t>
+              <w:t xml:space="preserve">Erweiterter Editor mit eingefügtem Code 1; unten links der grüne Haken „Es wurden keine Syntaxfehler gefunden“</w:t>
+            </w:r>
+          </w:p>
+        </w:tc>
+      </w:tr>
+    </w:tbl>
+    <w:p>
+      <w:pPr>
+        <w:spacing w:after="60"/>
+      </w:pPr>
+      <w:r>
+        <w:t xml:space="preserve"/>
+      </w:r>
+    </w:p>
+    <w:tbl>
+      <w:tblPr>
+        <w:tblW w:type="dxa" w:w="9638"/>
+        <w:tblBorders>
+          <w:top w:val="single" w:color="auto" w:sz="4"/>
+          <w:left w:val="single" w:color="auto" w:sz="4"/>
+          <w:bottom w:val="single" w:color="auto" w:sz="4"/>
+          <w:right w:val="single" w:color="auto" w:sz="4"/>
+          <w:insideH w:val="single" w:color="auto" w:sz="4"/>
+          <w:insideV w:val="single" w:color="auto" w:sz="4"/>
+        </w:tblBorders>
+      </w:tblPr>
+      <w:tblGrid>
+        <w:gridCol w:w="9638"/>
+      </w:tblGrid>
+      <w:tr>
+        <w:tc>
+          <w:tcPr>
+            <w:tcW w:type="dxa" w:w="9638"/>
+            <w:tcBorders>
+              <w:top w:val="single" w:color="E0B000" w:sz="6"/>
+              <w:left w:val="single" w:color="E0B000" w:sz="6"/>
+              <w:bottom w:val="single" w:color="E0B000" w:sz="6"/>
+              <w:right w:val="single" w:color="E0B000" w:sz="6"/>
+            </w:tcBorders>
+            <w:shd w:fill="FFF4CE" w:val="clear"/>
+            <w:tcMar>
+              <w:top w:type="dxa" w:w="120"/>
+              <w:left w:type="dxa" w:w="160"/>
+              <w:bottom w:type="dxa" w:w="120"/>
+              <w:right w:type="dxa" w:w="160"/>
+            </w:tcMar>
+          </w:tcPr>
+          <w:p>
+            <w:pPr>
+              <w:spacing w:after="0"/>
+            </w:pPr>
+            <w:r>
+              <w:rPr>
+                <w:b/>
+                <w:bCs/>
+              </w:rPr>
+              <w:t xml:space="preserve">Wichtig: </w:t>
+            </w:r>
+            <w:r>
+              <w:t xml:space="preserve">Der alte Text muss vollständig weg sein. Sonst erscheint eine Syntaxfehler-Meldung.</w:t>
             </w:r>
           </w:p>
         </w:tc>
@@ -992,27 +1130,142 @@
         <w:spacing w:after="80"/>
       </w:pPr>
       <w:r>
-        <w:t xml:space="preserve">Im Editor steht schon Text (z. B. „let Source = …“). </w:t>
-      </w:r>
-      <w:r>
-        <w:rPr>
-          <w:b/>
-          <w:bCs/>
-        </w:rPr>
-        <w:t xml:space="preserve">Lösche ihn komplett</w:t>
-      </w:r>
-      <w:r>
-        <w:t xml:space="preserve"> (Strg+A, Entf) und füge dann Code 1 aus dem Anhang ein (Strg+V). Klicke auf </w:t>
-      </w:r>
-      <w:r>
-        <w:rPr>
-          <w:b/>
-          <w:bCs/>
-        </w:rPr>
-        <w:t xml:space="preserve">Fertig</w:t>
+        <w:t xml:space="preserve">Es kommt die Meldung „Anmeldeinformationen erforderlich“: Wähle links </w:t>
+      </w:r>
+      <w:r>
+        <w:rPr>
+          <w:b/>
+          <w:bCs/>
+        </w:rPr>
+        <w:t xml:space="preserve">Microsoft-Konto</w:t>
+      </w:r>
+      <w:r>
+        <w:t xml:space="preserve"> (falls vorhanden alternativ „Organisationskonto“) → </w:t>
+      </w:r>
+      <w:r>
+        <w:rPr>
+          <w:b/>
+          <w:bCs/>
+        </w:rPr>
+        <w:t xml:space="preserve">Anmelden</w:t>
+      </w:r>
+      <w:r>
+        <w:t xml:space="preserve"> (mit deinem Schaeffler-Konto) → </w:t>
+      </w:r>
+      <w:r>
+        <w:rPr>
+          <w:b/>
+          <w:bCs/>
+        </w:rPr>
+        <w:t xml:space="preserve">Verbinden</w:t>
       </w:r>
       <w:r>
         <w:t xml:space="preserve">.</w:t>
+      </w:r>
+    </w:p>
+    <w:p>
+      <w:pPr>
+        <w:spacing w:after="160" w:before="80"/>
+        <w:jc w:val="center"/>
+      </w:pPr>
+      <w:r>
+        <w:drawing>
+          <wp:inline distT="0" distB="0" distL="0" distR="0">
+            <wp:extent cx="5334000" cy="2371725"/>
+            <wp:effectExtent t="0" r="0" b="0" l="0"/>
+            <wp:docPr id="1" name="image2.png" descr="image2.png" title="image2.png"/>
+            <wp:cNvGraphicFramePr>
+              <a:graphicFrameLocks xmlns:a="http://schemas.openxmlformats.org/drawingml/2006/main" noChangeAspect="1"/>
+            </wp:cNvGraphicFramePr>
+            <a:graphic xmlns:a="http://schemas.openxmlformats.org/drawingml/2006/main">
+              <a:graphicData uri="http://schemas.openxmlformats.org/drawingml/2006/picture">
+                <pic:pic xmlns:pic="http://schemas.openxmlformats.org/drawingml/2006/picture">
+                  <pic:nvPicPr>
+                    <pic:cNvPr id="0" name="" descr=""/>
+                    <pic:cNvPicPr>
+                      <a:picLocks noChangeAspect="1" noChangeArrowheads="1"/>
+                    </pic:cNvPicPr>
+                  </pic:nvPicPr>
+                  <pic:blipFill>
+                    <a:blip r:embed="rId8" cstate="none"/>
+                    <a:srcRect/>
+                    <a:stretch>
+                      <a:fillRect/>
+                    </a:stretch>
+                  </pic:blipFill>
+                  <pic:spPr bwMode="auto">
+                    <a:xfrm>
+                      <a:off x="0" y="0"/>
+                      <a:ext cx="5334000" cy="2371725"/>
+                    </a:xfrm>
+                    <a:prstGeom prst="rect">
+                      <a:avLst/>
+                    </a:prstGeom>
+                  </pic:spPr>
+                </pic:pic>
+              </a:graphicData>
+            </a:graphic>
+          </wp:inline>
+        </w:drawing>
+      </w:r>
+    </w:p>
+    <w:tbl>
+      <w:tblPr>
+        <w:tblW w:type="dxa" w:w="9638"/>
+        <w:tblBorders>
+          <w:top w:val="single" w:color="auto" w:sz="4"/>
+          <w:left w:val="single" w:color="auto" w:sz="4"/>
+          <w:bottom w:val="single" w:color="auto" w:sz="4"/>
+          <w:right w:val="single" w:color="auto" w:sz="4"/>
+          <w:insideH w:val="single" w:color="auto" w:sz="4"/>
+          <w:insideV w:val="single" w:color="auto" w:sz="4"/>
+        </w:tblBorders>
+      </w:tblPr>
+      <w:tblGrid>
+        <w:gridCol w:w="9638"/>
+      </w:tblGrid>
+      <w:tr>
+        <w:tc>
+          <w:tcPr>
+            <w:tcW w:type="dxa" w:w="9638"/>
+            <w:tcBorders>
+              <w:top w:val="single" w:color="E0B000" w:sz="6"/>
+              <w:left w:val="single" w:color="E0B000" w:sz="6"/>
+              <w:bottom w:val="single" w:color="E0B000" w:sz="6"/>
+              <w:right w:val="single" w:color="E0B000" w:sz="6"/>
+            </w:tcBorders>
+            <w:shd w:fill="FFF4CE" w:val="clear"/>
+            <w:tcMar>
+              <w:top w:type="dxa" w:w="120"/>
+              <w:left w:type="dxa" w:w="160"/>
+              <w:bottom w:type="dxa" w:w="120"/>
+              <w:right w:type="dxa" w:w="160"/>
+            </w:tcMar>
+          </w:tcPr>
+          <w:p>
+            <w:pPr>
+              <w:spacing w:after="0"/>
+            </w:pPr>
+            <w:r>
+              <w:rPr>
+                <w:b/>
+                <w:bCs/>
+              </w:rPr>
+              <w:t xml:space="preserve">Wichtig: </w:t>
+            </w:r>
+            <w:r>
+              <w:t xml:space="preserve">Kommt eine Meldung zu „Datenschutzebenen“ oder „Formula.Firewall“: Wähle „Organisation“ (bzw. „Ignorieren der Datenschutzebenen“, wenn nichts anderes geht) und bestätige.</w:t>
+            </w:r>
+          </w:p>
+        </w:tc>
+      </w:tr>
+    </w:tbl>
+    <w:p>
+      <w:pPr>
+        <w:spacing w:after="60"/>
+      </w:pPr>
+      <w:r>
+        <w:t xml:space="preserve"/>
       </w:r>
     </w:p>
     <w:tbl>
@@ -1075,66 +1328,7 @@
                 <w:sz w:val="20"/>
                 <w:szCs w:val="20"/>
               </w:rPr>
-              <w:t xml:space="preserve">Erweiterter Editor mit eingefügtem Code 1; unten links der grüne Haken „Es wurden keine Syntaxfehler gefunden“</w:t>
-            </w:r>
-          </w:p>
-        </w:tc>
-      </w:tr>
-    </w:tbl>
-    <w:p>
-      <w:pPr>
-        <w:spacing w:after="60"/>
-      </w:pPr>
-      <w:r>
-        <w:t xml:space="preserve"/>
-      </w:r>
-    </w:p>
-    <w:tbl>
-      <w:tblPr>
-        <w:tblW w:type="dxa" w:w="9638"/>
-        <w:tblBorders>
-          <w:top w:val="single" w:color="auto" w:sz="4"/>
-          <w:left w:val="single" w:color="auto" w:sz="4"/>
-          <w:bottom w:val="single" w:color="auto" w:sz="4"/>
-          <w:right w:val="single" w:color="auto" w:sz="4"/>
-          <w:insideH w:val="single" w:color="auto" w:sz="4"/>
-          <w:insideV w:val="single" w:color="auto" w:sz="4"/>
-        </w:tblBorders>
-      </w:tblPr>
-      <w:tblGrid>
-        <w:gridCol w:w="9638"/>
-      </w:tblGrid>
-      <w:tr>
-        <w:tc>
-          <w:tcPr>
-            <w:tcW w:type="dxa" w:w="9638"/>
-            <w:tcBorders>
-              <w:top w:val="single" w:color="E0B000" w:sz="6"/>
-              <w:left w:val="single" w:color="E0B000" w:sz="6"/>
-              <w:bottom w:val="single" w:color="E0B000" w:sz="6"/>
-              <w:right w:val="single" w:color="E0B000" w:sz="6"/>
-            </w:tcBorders>
-            <w:shd w:fill="FFF4CE" w:val="clear"/>
-            <w:tcMar>
-              <w:top w:type="dxa" w:w="120"/>
-              <w:left w:type="dxa" w:w="160"/>
-              <w:bottom w:type="dxa" w:w="120"/>
-              <w:right w:type="dxa" w:w="160"/>
-            </w:tcMar>
-          </w:tcPr>
-          <w:p>
-            <w:pPr>
-              <w:spacing w:after="0"/>
-            </w:pPr>
-            <w:r>
-              <w:rPr>
-                <w:b/>
-                <w:bCs/>
-              </w:rPr>
-              <w:t xml:space="preserve">Wichtig: </w:t>
-            </w:r>
-            <w:r>
-              <w:t xml:space="preserve">Der alte Text muss vollständig weg sein. Sonst erscheint eine Syntaxfehler-Meldung.</w:t>
+              <w:t xml:space="preserve">Falls sie erscheint: Meldung zu den Datenschutzebenen mit Auswahl „Organisation“</w:t>
             </w:r>
           </w:p>
         </w:tc>
@@ -1158,14 +1352,24 @@
         <w:spacing w:after="80"/>
       </w:pPr>
       <w:r>
-        <w:t xml:space="preserve">Es kommt die Meldung „Anmeldeinformationen erforderlich“: Wähle links </w:t>
-      </w:r>
-      <w:r>
-        <w:rPr>
-          <w:b/>
-          <w:bCs/>
-        </w:rPr>
-        <w:t xml:space="preserve">Organisationskonto</w:t>
+        <w:t xml:space="preserve">Rechts unter „Eigenschaften“ als Name </w:t>
+      </w:r>
+      <w:r>
+        <w:rPr>
+          <w:b/>
+          <w:bCs/>
+        </w:rPr>
+        <w:t xml:space="preserve">qSharePointPDFs</w:t>
+      </w:r>
+      <w:r>
+        <w:t xml:space="preserve"> eintragen und Enter drücken. Dann </w:t>
+      </w:r>
+      <w:r>
+        <w:rPr>
+          <w:b/>
+          <w:bCs/>
+        </w:rPr>
+        <w:t xml:space="preserve">Start</w:t>
       </w:r>
       <w:r>
         <w:t xml:space="preserve"> → </w:t>
@@ -1175,17 +1379,7 @@
           <w:b/>
           <w:bCs/>
         </w:rPr>
-        <w:t xml:space="preserve">Anmelden</w:t>
-      </w:r>
-      <w:r>
-        <w:t xml:space="preserve"> (mit deinem Schaeffler-Konto) → </w:t>
-      </w:r>
-      <w:r>
-        <w:rPr>
-          <w:b/>
-          <w:bCs/>
-        </w:rPr>
-        <w:t xml:space="preserve">Verbinden</w:t>
+        <w:t xml:space="preserve">Schließen &amp; laden in…</w:t>
       </w:r>
       <w:r>
         <w:t xml:space="preserve">.</w:t>
@@ -1251,7 +1445,7 @@
                 <w:sz w:val="20"/>
                 <w:szCs w:val="20"/>
               </w:rPr>
-              <w:t xml:space="preserve">Fenster „Auf SharePoint zugreifen“ mit links ausgewähltem „Organisationskonto“ und Schaltflächen „Anmelden“ / „Verbinden“</w:t>
+              <w:t xml:space="preserve">Rechte Seitenleiste „Eigenschaften“ mit Name qSharePointPDFs; Schaltfläche „Schließen &amp; laden“ mit Dropdown „Schließen &amp; laden in…“</w:t>
             </w:r>
           </w:p>
         </w:tc>
@@ -1265,63 +1459,37 @@
         <w:t xml:space="preserve"/>
       </w:r>
     </w:p>
-    <w:tbl>
-      <w:tblPr>
-        <w:tblW w:type="dxa" w:w="9638"/>
-        <w:tblBorders>
-          <w:top w:val="single" w:color="auto" w:sz="4"/>
-          <w:left w:val="single" w:color="auto" w:sz="4"/>
-          <w:bottom w:val="single" w:color="auto" w:sz="4"/>
-          <w:right w:val="single" w:color="auto" w:sz="4"/>
-          <w:insideH w:val="single" w:color="auto" w:sz="4"/>
-          <w:insideV w:val="single" w:color="auto" w:sz="4"/>
-        </w:tblBorders>
-      </w:tblPr>
-      <w:tblGrid>
-        <w:gridCol w:w="9638"/>
-      </w:tblGrid>
-      <w:tr>
-        <w:tc>
-          <w:tcPr>
-            <w:tcW w:type="dxa" w:w="9638"/>
-            <w:tcBorders>
-              <w:top w:val="single" w:color="E0B000" w:sz="6"/>
-              <w:left w:val="single" w:color="E0B000" w:sz="6"/>
-              <w:bottom w:val="single" w:color="E0B000" w:sz="6"/>
-              <w:right w:val="single" w:color="E0B000" w:sz="6"/>
-            </w:tcBorders>
-            <w:shd w:fill="FFF4CE" w:val="clear"/>
-            <w:tcMar>
-              <w:top w:type="dxa" w:w="120"/>
-              <w:left w:type="dxa" w:w="160"/>
-              <w:bottom w:type="dxa" w:w="120"/>
-              <w:right w:type="dxa" w:w="160"/>
-            </w:tcMar>
-          </w:tcPr>
-          <w:p>
-            <w:pPr>
-              <w:spacing w:after="0"/>
-            </w:pPr>
-            <w:r>
-              <w:rPr>
-                <w:b/>
-                <w:bCs/>
-              </w:rPr>
-              <w:t xml:space="preserve">Wichtig: </w:t>
-            </w:r>
-            <w:r>
-              <w:t xml:space="preserve">Kommt eine Meldung zu „Datenschutzebenen“ oder „Formula.Firewall“: Wähle „Organisation“ (bzw. „Ignorieren der Datenschutzebenen“, wenn nichts anderes geht) und bestätige.</w:t>
-            </w:r>
-          </w:p>
-        </w:tc>
-      </w:tr>
-    </w:tbl>
-    <w:p>
-      <w:pPr>
-        <w:spacing w:after="60"/>
-      </w:pPr>
-      <w:r>
-        <w:t xml:space="preserve"/>
+    <w:p>
+      <w:pPr>
+        <w:pStyle w:val="ListParagraph"/>
+        <w:numPr>
+          <w:ilvl w:val="0"/>
+          <w:numId w:val="4"/>
+        </w:numPr>
+        <w:spacing w:after="80"/>
+      </w:pPr>
+      <w:r>
+        <w:t xml:space="preserve">Im Fenster wähle </w:t>
+      </w:r>
+      <w:r>
+        <w:rPr>
+          <w:b/>
+          <w:bCs/>
+        </w:rPr>
+        <w:t xml:space="preserve">Nur Verbindung erstellen</w:t>
+      </w:r>
+      <w:r>
+        <w:t xml:space="preserve"> → </w:t>
+      </w:r>
+      <w:r>
+        <w:rPr>
+          <w:b/>
+          <w:bCs/>
+        </w:rPr>
+        <w:t xml:space="preserve">OK</w:t>
+      </w:r>
+      <w:r>
+        <w:t xml:space="preserve">.</w:t>
       </w:r>
     </w:p>
     <w:tbl>
@@ -1384,7 +1552,7 @@
                 <w:sz w:val="20"/>
                 <w:szCs w:val="20"/>
               </w:rPr>
-              <w:t xml:space="preserve">Falls sie erscheint: Meldung zu den Datenschutzebenen mit Auswahl „Organisation“</w:t>
+              <w:t xml:space="preserve">Fenster „Daten importieren“ mit ausgewähltem „Nur Verbindung erstellen“</w:t>
             </w:r>
           </w:p>
         </w:tc>
@@ -1396,49 +1564,6 @@
       </w:pPr>
       <w:r>
         <w:t xml:space="preserve"/>
-      </w:r>
-    </w:p>
-    <w:p>
-      <w:pPr>
-        <w:pStyle w:val="ListParagraph"/>
-        <w:numPr>
-          <w:ilvl w:val="0"/>
-          <w:numId w:val="4"/>
-        </w:numPr>
-        <w:spacing w:after="80"/>
-      </w:pPr>
-      <w:r>
-        <w:t xml:space="preserve">Rechts unter „Eigenschaften“ als Name </w:t>
-      </w:r>
-      <w:r>
-        <w:rPr>
-          <w:b/>
-          <w:bCs/>
-        </w:rPr>
-        <w:t xml:space="preserve">qSharePointPDFs</w:t>
-      </w:r>
-      <w:r>
-        <w:t xml:space="preserve"> eintragen und Enter drücken. Dann </w:t>
-      </w:r>
-      <w:r>
-        <w:rPr>
-          <w:b/>
-          <w:bCs/>
-        </w:rPr>
-        <w:t xml:space="preserve">Start</w:t>
-      </w:r>
-      <w:r>
-        <w:t xml:space="preserve"> → </w:t>
-      </w:r>
-      <w:r>
-        <w:rPr>
-          <w:b/>
-          <w:bCs/>
-        </w:rPr>
-        <w:t xml:space="preserve">Schließen &amp; laden in…</w:t>
-      </w:r>
-      <w:r>
-        <w:t xml:space="preserve">.</w:t>
       </w:r>
     </w:p>
     <w:tbl>
@@ -1501,7 +1626,7 @@
                 <w:sz w:val="20"/>
                 <w:szCs w:val="20"/>
               </w:rPr>
-              <w:t xml:space="preserve">Rechte Seitenleiste „Eigenschaften“ mit Name qSharePointPDFs; Schaltfläche „Schließen &amp; laden“ mit Dropdown „Schließen &amp; laden in…“</w:t>
+              <w:t xml:space="preserve">Excel nach Schritt 2: Rechts die Seitenleiste „Abfragen &amp; Verbindungen“ mit qSharePointPDFs („Nur Verbindung“)</w:t>
             </w:r>
           </w:p>
         </w:tc>
@@ -1516,23 +1641,37 @@
       </w:r>
     </w:p>
     <w:p>
+      <w:r>
+        <w:br w:type="page"/>
+      </w:r>
+    </w:p>
+    <w:p>
+      <w:pPr>
+        <w:pStyle w:val="Heading1"/>
+        <w:spacing w:after="120" w:before="300"/>
+      </w:pPr>
+      <w:r>
+        <w:t xml:space="preserve">Schritt 3: Artikel den Zeichnungen zuordnen</w:t>
+      </w:r>
+    </w:p>
+    <w:p>
       <w:pPr>
         <w:pStyle w:val="ListParagraph"/>
         <w:numPr>
           <w:ilvl w:val="0"/>
-          <w:numId w:val="4"/>
+          <w:numId w:val="5"/>
         </w:numPr>
         <w:spacing w:after="80"/>
       </w:pPr>
       <w:r>
-        <w:t xml:space="preserve">Im Fenster wähle </w:t>
-      </w:r>
-      <w:r>
-        <w:rPr>
-          <w:b/>
-          <w:bCs/>
-        </w:rPr>
-        <w:t xml:space="preserve">Nur Verbindung erstellen</w:t>
+        <w:t xml:space="preserve">Klicke in deine Artikeltabelle (Schritt 1). Dann </w:t>
+      </w:r>
+      <w:r>
+        <w:rPr>
+          <w:b/>
+          <w:bCs/>
+        </w:rPr>
+        <w:t xml:space="preserve">Daten</w:t>
       </w:r>
       <w:r>
         <w:t xml:space="preserve"> → </w:t>
@@ -1542,10 +1681,10 @@
           <w:b/>
           <w:bCs/>
         </w:rPr>
-        <w:t xml:space="preserve">OK</w:t>
-      </w:r>
-      <w:r>
-        <w:t xml:space="preserve">.</w:t>
+        <w:t xml:space="preserve">Aus Tabelle/Bereich</w:t>
+      </w:r>
+      <w:r>
+        <w:t xml:space="preserve">. Es öffnet sich wieder der Power Query-Editor.</w:t>
       </w:r>
     </w:p>
     <w:tbl>
@@ -1608,7 +1747,7 @@
                 <w:sz w:val="20"/>
                 <w:szCs w:val="20"/>
               </w:rPr>
-              <w:t xml:space="preserve">Fenster „Daten importieren“ mit ausgewähltem „Nur Verbindung erstellen“</w:t>
+              <w:t xml:space="preserve">Zelle in tblArtikel angeklickt, Reiter „Daten“, Schaltfläche „Aus Tabelle/Bereich“ (rot umkreisen)</w:t>
             </w:r>
           </w:p>
         </w:tc>
@@ -1682,7 +1821,7 @@
                 <w:sz w:val="20"/>
                 <w:szCs w:val="20"/>
               </w:rPr>
-              <w:t xml:space="preserve">Excel nach Schritt 2: Rechts die Seitenleiste „Abfragen &amp; Verbindungen“ mit qSharePointPDFs („Nur Verbindung“)</w:t>
+              <w:t xml:space="preserve">Power Query-Editor mit der geladenen Artikeltabelle</w:t>
             </w:r>
           </w:p>
         </w:tc>
@@ -1694,20 +1833,6 @@
       </w:pPr>
       <w:r>
         <w:t xml:space="preserve"/>
-      </w:r>
-    </w:p>
-    <w:p>
-      <w:r>
-        <w:br w:type="page"/>
-      </w:r>
-    </w:p>
-    <w:p>
-      <w:pPr>
-        <w:pStyle w:val="Heading1"/>
-        <w:spacing w:after="120" w:before="300"/>
-      </w:pPr>
-      <w:r>
-        <w:t xml:space="preserve">Schritt 3: Artikel den Zeichnungen zuordnen</w:t>
       </w:r>
     </w:p>
     <w:p>
@@ -1720,14 +1845,11 @@
         <w:spacing w:after="80"/>
       </w:pPr>
       <w:r>
-        <w:t xml:space="preserve">Klicke in deine Artikeltabelle (Schritt 1). Dann </w:t>
-      </w:r>
-      <w:r>
-        <w:rPr>
-          <w:b/>
-          <w:bCs/>
-        </w:rPr>
-        <w:t xml:space="preserve">Daten</w:t>
+        <w:rPr>
+          <w:b/>
+          <w:bCs/>
+        </w:rPr>
+        <w:t xml:space="preserve">Start</w:t>
       </w:r>
       <w:r>
         <w:t xml:space="preserve"> → </w:t>
@@ -1737,10 +1859,224 @@
           <w:b/>
           <w:bCs/>
         </w:rPr>
-        <w:t xml:space="preserve">Aus Tabelle/Bereich</w:t>
-      </w:r>
-      <w:r>
-        <w:t xml:space="preserve">. Es öffnet sich wieder der Power Query-Editor.</w:t>
+        <w:t xml:space="preserve">Erweiterter Editor</w:t>
+      </w:r>
+      <w:r>
+        <w:t xml:space="preserve">. Alten Text komplett löschen und Code 2 aus dem Anhang einfügen.</w:t>
+      </w:r>
+    </w:p>
+    <w:p>
+      <w:pPr>
+        <w:pStyle w:val="ListParagraph"/>
+        <w:numPr>
+          <w:ilvl w:val="0"/>
+          <w:numId w:val="5"/>
+        </w:numPr>
+        <w:spacing w:after="80"/>
+      </w:pPr>
+      <w:r>
+        <w:rPr>
+          <w:b/>
+          <w:bCs/>
+        </w:rPr>
+        <w:t xml:space="preserve">Nur falls nötig: </w:t>
+      </w:r>
+      <w:r>
+        <w:t xml:space="preserve">Heißt deine Tabelle oder Spalte anders, ersetze im Code (Strg+H) </w:t>
+      </w:r>
+      <w:r>
+        <w:rPr>
+          <w:b/>
+          <w:bCs/>
+        </w:rPr>
+        <w:t xml:space="preserve">tblArtikel</w:t>
+      </w:r>
+      <w:r>
+        <w:t xml:space="preserve"> und </w:t>
+      </w:r>
+      <w:r>
+        <w:rPr>
+          <w:b/>
+          <w:bCs/>
+        </w:rPr>
+        <w:t xml:space="preserve">Global article number</w:t>
+      </w:r>
+      <w:r>
+        <w:t xml:space="preserve"> durch deine Namen – an allen Stellen. Dann </w:t>
+      </w:r>
+      <w:r>
+        <w:rPr>
+          <w:b/>
+          <w:bCs/>
+        </w:rPr>
+        <w:t xml:space="preserve">Fertig</w:t>
+      </w:r>
+      <w:r>
+        <w:t xml:space="preserve">.</w:t>
+      </w:r>
+    </w:p>
+    <w:p>
+      <w:pPr>
+        <w:spacing w:after="160" w:before="80"/>
+        <w:jc w:val="center"/>
+      </w:pPr>
+      <w:r>
+        <w:drawing>
+          <wp:inline distT="0" distB="0" distL="0" distR="0">
+            <wp:extent cx="4953000" cy="3781425"/>
+            <wp:effectExtent t="0" r="0" b="0" l="0"/>
+            <wp:docPr id="1" name="image3.png" descr="image3.png" title="image3.png"/>
+            <wp:cNvGraphicFramePr>
+              <a:graphicFrameLocks xmlns:a="http://schemas.openxmlformats.org/drawingml/2006/main" noChangeAspect="1"/>
+            </wp:cNvGraphicFramePr>
+            <a:graphic xmlns:a="http://schemas.openxmlformats.org/drawingml/2006/main">
+              <a:graphicData uri="http://schemas.openxmlformats.org/drawingml/2006/picture">
+                <pic:pic xmlns:pic="http://schemas.openxmlformats.org/drawingml/2006/picture">
+                  <pic:nvPicPr>
+                    <pic:cNvPr id="0" name="" descr=""/>
+                    <pic:cNvPicPr>
+                      <a:picLocks noChangeAspect="1" noChangeArrowheads="1"/>
+                    </pic:cNvPicPr>
+                  </pic:nvPicPr>
+                  <pic:blipFill>
+                    <a:blip r:embed="rId9" cstate="none"/>
+                    <a:srcRect/>
+                    <a:stretch>
+                      <a:fillRect/>
+                    </a:stretch>
+                  </pic:blipFill>
+                  <pic:spPr bwMode="auto">
+                    <a:xfrm>
+                      <a:off x="0" y="0"/>
+                      <a:ext cx="4953000" cy="3781425"/>
+                    </a:xfrm>
+                    <a:prstGeom prst="rect">
+                      <a:avLst/>
+                    </a:prstGeom>
+                  </pic:spPr>
+                </pic:pic>
+              </a:graphicData>
+            </a:graphic>
+          </wp:inline>
+        </w:drawing>
+      </w:r>
+    </w:p>
+    <w:p>
+      <w:pPr>
+        <w:spacing w:after="100"/>
+        <w:jc w:val="center"/>
+      </w:pPr>
+      <w:r>
+        <w:t xml:space="preserve">Beispielansicht: Dein Code kann etwas anders aussehen. Wichtig ist der grüne Haken „Es wurden keine Syntaxfehler erkannt“.</w:t>
+      </w:r>
+    </w:p>
+    <w:p>
+      <w:pPr>
+        <w:pStyle w:val="ListParagraph"/>
+        <w:numPr>
+          <w:ilvl w:val="0"/>
+          <w:numId w:val="5"/>
+        </w:numPr>
+        <w:spacing w:after="80"/>
+      </w:pPr>
+      <w:r>
+        <w:t xml:space="preserve">Name rechts: </w:t>
+      </w:r>
+      <w:r>
+        <w:rPr>
+          <w:b/>
+          <w:bCs/>
+        </w:rPr>
+        <w:t xml:space="preserve">qArtikel</w:t>
+      </w:r>
+      <w:r>
+        <w:t xml:space="preserve">. Dann </w:t>
+      </w:r>
+      <w:r>
+        <w:rPr>
+          <w:b/>
+          <w:bCs/>
+        </w:rPr>
+        <w:t xml:space="preserve">Schließen &amp; laden in…</w:t>
+      </w:r>
+      <w:r>
+        <w:t xml:space="preserve"> → </w:t>
+      </w:r>
+      <w:r>
+        <w:rPr>
+          <w:b/>
+          <w:bCs/>
+        </w:rPr>
+        <w:t xml:space="preserve">Tabelle</w:t>
+      </w:r>
+      <w:r>
+        <w:t xml:space="preserve"> → </w:t>
+      </w:r>
+      <w:r>
+        <w:rPr>
+          <w:b/>
+          <w:bCs/>
+        </w:rPr>
+        <w:t xml:space="preserve">Neues Arbeitsblatt</w:t>
+      </w:r>
+      <w:r>
+        <w:t xml:space="preserve"> → </w:t>
+      </w:r>
+      <w:r>
+        <w:rPr>
+          <w:b/>
+          <w:bCs/>
+        </w:rPr>
+        <w:t xml:space="preserve">OK</w:t>
+      </w:r>
+      <w:r>
+        <w:t xml:space="preserve">.</w:t>
+      </w:r>
+    </w:p>
+    <w:p>
+      <w:pPr>
+        <w:spacing w:after="160" w:before="80"/>
+        <w:jc w:val="center"/>
+      </w:pPr>
+      <w:r>
+        <w:drawing>
+          <wp:inline distT="0" distB="0" distL="0" distR="0">
+            <wp:extent cx="1809750" cy="2676525"/>
+            <wp:effectExtent t="0" r="0" b="0" l="0"/>
+            <wp:docPr id="1" name="image4.png" descr="image4.png" title="image4.png"/>
+            <wp:cNvGraphicFramePr>
+              <a:graphicFrameLocks xmlns:a="http://schemas.openxmlformats.org/drawingml/2006/main" noChangeAspect="1"/>
+            </wp:cNvGraphicFramePr>
+            <a:graphic xmlns:a="http://schemas.openxmlformats.org/drawingml/2006/main">
+              <a:graphicData uri="http://schemas.openxmlformats.org/drawingml/2006/picture">
+                <pic:pic xmlns:pic="http://schemas.openxmlformats.org/drawingml/2006/picture">
+                  <pic:nvPicPr>
+                    <pic:cNvPr id="0" name="" descr=""/>
+                    <pic:cNvPicPr>
+                      <a:picLocks noChangeAspect="1" noChangeArrowheads="1"/>
+                    </pic:cNvPicPr>
+                  </pic:nvPicPr>
+                  <pic:blipFill>
+                    <a:blip r:embed="rId10" cstate="none"/>
+                    <a:srcRect/>
+                    <a:stretch>
+                      <a:fillRect/>
+                    </a:stretch>
+                  </pic:blipFill>
+                  <pic:spPr bwMode="auto">
+                    <a:xfrm>
+                      <a:off x="0" y="0"/>
+                      <a:ext cx="1809750" cy="2676525"/>
+                    </a:xfrm>
+                    <a:prstGeom prst="rect">
+                      <a:avLst/>
+                    </a:prstGeom>
+                  </pic:spPr>
+                </pic:pic>
+              </a:graphicData>
+            </a:graphic>
+          </wp:inline>
+        </w:drawing>
       </w:r>
     </w:p>
     <w:tbl>
@@ -1803,7 +2139,7 @@
                 <w:sz w:val="20"/>
                 <w:szCs w:val="20"/>
               </w:rPr>
-              <w:t xml:space="preserve">Zelle in tblArtikel angeklickt, Reiter „Daten“, Schaltfläche „Aus Tabelle/Bereich“ (rot umkreisen)</w:t>
+              <w:t xml:space="preserve">Fenster „Daten importieren“ mit „Tabelle“ und „Neues Arbeitsblatt“</w:t>
             </w:r>
           </w:p>
         </w:tc>
@@ -1815,6 +2151,88 @@
       </w:pPr>
       <w:r>
         <w:t xml:space="preserve"/>
+      </w:r>
+    </w:p>
+    <w:p>
+      <w:r>
+        <w:br w:type="page"/>
+      </w:r>
+    </w:p>
+    <w:p>
+      <w:pPr>
+        <w:pStyle w:val="Heading1"/>
+        <w:spacing w:after="120" w:before="300"/>
+      </w:pPr>
+      <w:r>
+        <w:t xml:space="preserve">Schritt 4: Ergebnis prüfen</w:t>
+      </w:r>
+    </w:p>
+    <w:p>
+      <w:pPr>
+        <w:spacing w:after="100"/>
+      </w:pPr>
+      <w:r>
+        <w:t xml:space="preserve">Auf dem neuen Arbeitsblatt siehst du drei Spalten:</w:t>
+      </w:r>
+    </w:p>
+    <w:p>
+      <w:pPr>
+        <w:pStyle w:val="ListParagraph"/>
+        <w:numPr>
+          <w:ilvl w:val="0"/>
+          <w:numId w:val="2"/>
+        </w:numPr>
+        <w:spacing w:after="60"/>
+      </w:pPr>
+      <w:r>
+        <w:rPr>
+          <w:b/>
+          <w:bCs/>
+        </w:rPr>
+        <w:t xml:space="preserve">Global article number</w:t>
+      </w:r>
+      <w:r>
+        <w:t xml:space="preserve"> – deine Artikelnummer</w:t>
+      </w:r>
+    </w:p>
+    <w:p>
+      <w:pPr>
+        <w:pStyle w:val="ListParagraph"/>
+        <w:numPr>
+          <w:ilvl w:val="0"/>
+          <w:numId w:val="2"/>
+        </w:numPr>
+        <w:spacing w:after="60"/>
+      </w:pPr>
+      <w:r>
+        <w:rPr>
+          <w:b/>
+          <w:bCs/>
+        </w:rPr>
+        <w:t xml:space="preserve">Zeichnung_Link</w:t>
+      </w:r>
+      <w:r>
+        <w:t xml:space="preserve"> – Adresse der PDF im SharePoint</w:t>
+      </w:r>
+    </w:p>
+    <w:p>
+      <w:pPr>
+        <w:pStyle w:val="ListParagraph"/>
+        <w:numPr>
+          <w:ilvl w:val="0"/>
+          <w:numId w:val="2"/>
+        </w:numPr>
+        <w:spacing w:after="60"/>
+      </w:pPr>
+      <w:r>
+        <w:rPr>
+          <w:b/>
+          <w:bCs/>
+        </w:rPr>
+        <w:t xml:space="preserve">Trefferanzahl</w:t>
+      </w:r>
+      <w:r>
+        <w:t xml:space="preserve"> – wie viele passende PDFs gefunden wurden</w:t>
       </w:r>
     </w:p>
     <w:tbl>
@@ -1877,7 +2295,7 @@
                 <w:sz w:val="20"/>
                 <w:szCs w:val="20"/>
               </w:rPr>
-              <w:t xml:space="preserve">Power Query-Editor mit der geladenen Artikeltabelle</w:t>
+              <w:t xml:space="preserve">Ergebnis-Arbeitsblatt qArtikel mit gefüllten Links (Beispielwerte ggf. unkenntlich machen)</w:t>
             </w:r>
           </w:p>
         </w:tc>
@@ -1893,32 +2311,31 @@
     </w:p>
     <w:p>
       <w:pPr>
+        <w:pStyle w:val="Heading2"/>
+        <w:spacing w:after="100" w:before="200"/>
+      </w:pPr>
+      <w:r>
+        <w:t xml:space="preserve">Prüfen</w:t>
+      </w:r>
+    </w:p>
+    <w:p>
+      <w:pPr>
         <w:pStyle w:val="ListParagraph"/>
         <w:numPr>
           <w:ilvl w:val="0"/>
-          <w:numId w:val="5"/>
+          <w:numId w:val="2"/>
         </w:numPr>
-        <w:spacing w:after="80"/>
-      </w:pPr>
-      <w:r>
-        <w:rPr>
-          <w:b/>
-          <w:bCs/>
-        </w:rPr>
-        <w:t xml:space="preserve">Start</w:t>
-      </w:r>
-      <w:r>
-        <w:t xml:space="preserve"> → </w:t>
-      </w:r>
-      <w:r>
-        <w:rPr>
-          <w:b/>
-          <w:bCs/>
-        </w:rPr>
-        <w:t xml:space="preserve">Erweiterter Editor</w:t>
-      </w:r>
-      <w:r>
-        <w:t xml:space="preserve">. Alten Text komplett löschen und Code 2 aus dem Anhang einfügen.</w:t>
+        <w:spacing w:after="60"/>
+      </w:pPr>
+      <w:r>
+        <w:rPr>
+          <w:b/>
+          <w:bCs/>
+        </w:rPr>
+        <w:t xml:space="preserve">Link leer: </w:t>
+      </w:r>
+      <w:r>
+        <w:t xml:space="preserve">Keine passende PDF gefunden. Prüfen, ob im Ordner 060_Zeichnungen des Artikels eine PDF liegt.</w:t>
       </w:r>
     </w:p>
     <w:p>
@@ -1926,49 +2343,19 @@
         <w:pStyle w:val="ListParagraph"/>
         <w:numPr>
           <w:ilvl w:val="0"/>
-          <w:numId w:val="5"/>
+          <w:numId w:val="2"/>
         </w:numPr>
-        <w:spacing w:after="80"/>
-      </w:pPr>
-      <w:r>
-        <w:rPr>
-          <w:b/>
-          <w:bCs/>
-        </w:rPr>
-        <w:t xml:space="preserve">Nur falls nötig: </w:t>
-      </w:r>
-      <w:r>
-        <w:t xml:space="preserve">Heißt deine Tabelle oder Spalte anders, ersetze im Code (Strg+H) </w:t>
-      </w:r>
-      <w:r>
-        <w:rPr>
-          <w:b/>
-          <w:bCs/>
-        </w:rPr>
-        <w:t xml:space="preserve">tblArtikel</w:t>
-      </w:r>
-      <w:r>
-        <w:t xml:space="preserve"> und </w:t>
-      </w:r>
-      <w:r>
-        <w:rPr>
-          <w:b/>
-          <w:bCs/>
-        </w:rPr>
-        <w:t xml:space="preserve">Global article number</w:t>
-      </w:r>
-      <w:r>
-        <w:t xml:space="preserve"> durch deine Namen – an allen Stellen. Dann </w:t>
-      </w:r>
-      <w:r>
-        <w:rPr>
-          <w:b/>
-          <w:bCs/>
-        </w:rPr>
-        <w:t xml:space="preserve">Fertig</w:t>
-      </w:r>
-      <w:r>
-        <w:t xml:space="preserve">.</w:t>
+        <w:spacing w:after="60"/>
+      </w:pPr>
+      <w:r>
+        <w:rPr>
+          <w:b/>
+          <w:bCs/>
+        </w:rPr>
+        <w:t xml:space="preserve">Trefferanzahl größer als 1: </w:t>
+      </w:r>
+      <w:r>
+        <w:t xml:space="preserve">Im Ordner 060_Zeichnungen liegen mehrere PDFs. Vorgeschlagen wird die zuletzt geänderte. Bitte kurz kontrollieren.</w:t>
       </w:r>
     </w:p>
     <w:tbl>
@@ -2031,7 +2418,7 @@
                 <w:sz w:val="20"/>
                 <w:szCs w:val="20"/>
               </w:rPr>
-              <w:t xml:space="preserve">Erweiterter Editor mit Code 2 und grünem Haken „Keine Syntaxfehler“</w:t>
+              <w:t xml:space="preserve">Beispielzeile mit leerem Link und Zeile mit Trefferanzahl 2 (markieren)</w:t>
             </w:r>
           </w:p>
         </w:tc>
@@ -2047,65 +2434,28 @@
     </w:p>
     <w:p>
       <w:pPr>
-        <w:pStyle w:val="ListParagraph"/>
-        <w:numPr>
-          <w:ilvl w:val="0"/>
-          <w:numId w:val="5"/>
-        </w:numPr>
-        <w:spacing w:after="80"/>
-      </w:pPr>
-      <w:r>
-        <w:t xml:space="preserve">Name rechts: </w:t>
-      </w:r>
-      <w:r>
-        <w:rPr>
-          <w:b/>
-          <w:bCs/>
-        </w:rPr>
-        <w:t xml:space="preserve">qArtikel</w:t>
-      </w:r>
-      <w:r>
-        <w:t xml:space="preserve">. Dann </w:t>
-      </w:r>
-      <w:r>
-        <w:rPr>
-          <w:b/>
-          <w:bCs/>
-        </w:rPr>
-        <w:t xml:space="preserve">Schließen &amp; laden in…</w:t>
-      </w:r>
-      <w:r>
-        <w:t xml:space="preserve"> → </w:t>
-      </w:r>
-      <w:r>
-        <w:rPr>
-          <w:b/>
-          <w:bCs/>
-        </w:rPr>
-        <w:t xml:space="preserve">Tabelle</w:t>
-      </w:r>
-      <w:r>
-        <w:t xml:space="preserve"> → </w:t>
-      </w:r>
-      <w:r>
-        <w:rPr>
-          <w:b/>
-          <w:bCs/>
-        </w:rPr>
-        <w:t xml:space="preserve">Neues Arbeitsblatt</w:t>
-      </w:r>
-      <w:r>
-        <w:t xml:space="preserve"> → </w:t>
-      </w:r>
-      <w:r>
-        <w:rPr>
-          <w:b/>
-          <w:bCs/>
-        </w:rPr>
-        <w:t xml:space="preserve">OK</w:t>
-      </w:r>
-      <w:r>
-        <w:t xml:space="preserve">.</w:t>
+        <w:pStyle w:val="Heading2"/>
+        <w:spacing w:after="100" w:before="200"/>
+      </w:pPr>
+      <w:r>
+        <w:t xml:space="preserve">Optional: Link klickbar machen</w:t>
+      </w:r>
+    </w:p>
+    <w:p>
+      <w:pPr>
+        <w:spacing w:after="100"/>
+      </w:pPr>
+      <w:r>
+        <w:t xml:space="preserve">Die Links sind zunächst nur Text. Für einen Klick-Link: Schreibe in die Zelle neben der Tabelle (Spalte D, erste Datenzeile) die Formel </w:t>
+      </w:r>
+      <w:r>
+        <w:rPr>
+          <w:rFonts w:ascii="Consolas" w:cs="Consolas" w:eastAsia="Consolas" w:hAnsi="Consolas"/>
+        </w:rPr>
+        <w:t xml:space="preserve">=HYPERLINK([@Zeichnung_Link];"PDF öffnen")</w:t>
+      </w:r>
+      <w:r>
+        <w:t xml:space="preserve"> und bestätige mit Enter. Excel füllt die Spalte automatisch nach unten. Mit englischem Excel ein Komma statt Semikolon verwenden.</w:t>
       </w:r>
     </w:p>
     <w:tbl>
@@ -2168,7 +2518,7 @@
                 <w:sz w:val="20"/>
                 <w:szCs w:val="20"/>
               </w:rPr>
-              <w:t xml:space="preserve">Fenster „Daten importieren“ mit „Tabelle“ und „Neues Arbeitsblatt“</w:t>
+              <w:t xml:space="preserve">Neue Spalte mit der HYPERLINK-Formel und blauen „PDF öffnen“-Links</w:t>
             </w:r>
           </w:p>
         </w:tc>
@@ -2183,17 +2533,12 @@
       </w:r>
     </w:p>
     <w:p>
-      <w:r>
-        <w:br w:type="page"/>
-      </w:r>
-    </w:p>
-    <w:p>
-      <w:pPr>
-        <w:pStyle w:val="Heading1"/>
-        <w:spacing w:after="120" w:before="300"/>
-      </w:pPr>
-      <w:r>
-        <w:t xml:space="preserve">Schritt 4: Ergebnis prüfen</w:t>
+      <w:pPr>
+        <w:pStyle w:val="Heading2"/>
+        <w:spacing w:after="100" w:before="200"/>
+      </w:pPr>
+      <w:r>
+        <w:t xml:space="preserve">Später aktualisieren</w:t>
       </w:r>
     </w:p>
     <w:p>
@@ -2201,67 +2546,24 @@
         <w:spacing w:after="100"/>
       </w:pPr>
       <w:r>
-        <w:t xml:space="preserve">Auf dem neuen Arbeitsblatt siehst du drei Spalten:</w:t>
-      </w:r>
-    </w:p>
-    <w:p>
-      <w:pPr>
-        <w:pStyle w:val="ListParagraph"/>
-        <w:numPr>
-          <w:ilvl w:val="0"/>
-          <w:numId w:val="2"/>
-        </w:numPr>
-        <w:spacing w:after="60"/>
-      </w:pPr>
-      <w:r>
-        <w:rPr>
-          <w:b/>
-          <w:bCs/>
-        </w:rPr>
-        <w:t xml:space="preserve">Global article number</w:t>
-      </w:r>
-      <w:r>
-        <w:t xml:space="preserve"> – deine Artikelnummer</w:t>
-      </w:r>
-    </w:p>
-    <w:p>
-      <w:pPr>
-        <w:pStyle w:val="ListParagraph"/>
-        <w:numPr>
-          <w:ilvl w:val="0"/>
-          <w:numId w:val="2"/>
-        </w:numPr>
-        <w:spacing w:after="60"/>
-      </w:pPr>
-      <w:r>
-        <w:rPr>
-          <w:b/>
-          <w:bCs/>
-        </w:rPr>
-        <w:t xml:space="preserve">Zeichnung_Link</w:t>
-      </w:r>
-      <w:r>
-        <w:t xml:space="preserve"> – Adresse der PDF im SharePoint</w:t>
-      </w:r>
-    </w:p>
-    <w:p>
-      <w:pPr>
-        <w:pStyle w:val="ListParagraph"/>
-        <w:numPr>
-          <w:ilvl w:val="0"/>
-          <w:numId w:val="2"/>
-        </w:numPr>
-        <w:spacing w:after="60"/>
-      </w:pPr>
-      <w:r>
-        <w:rPr>
-          <w:b/>
-          <w:bCs/>
-        </w:rPr>
-        <w:t xml:space="preserve">Trefferanzahl</w:t>
-      </w:r>
-      <w:r>
-        <w:t xml:space="preserve"> – wie viele passende PDFs gefunden wurden</w:t>
+        <w:rPr>
+          <w:b/>
+          <w:bCs/>
+        </w:rPr>
+        <w:t xml:space="preserve">Daten</w:t>
+      </w:r>
+      <w:r>
+        <w:t xml:space="preserve"> → </w:t>
+      </w:r>
+      <w:r>
+        <w:rPr>
+          <w:b/>
+          <w:bCs/>
+        </w:rPr>
+        <w:t xml:space="preserve">Alle aktualisieren</w:t>
+      </w:r>
+      <w:r>
+        <w:t xml:space="preserve">. Neue Artikel in die Tabelle tblArtikel schreiben, dann aktualisieren.</w:t>
       </w:r>
     </w:p>
     <w:tbl>
@@ -2309,337 +2611,6 @@
                 <w:color w:val="555555"/>
               </w:rPr>
               <w:t xml:space="preserve">[ Screenshot 19 hier einfügen ]</w:t>
-            </w:r>
-          </w:p>
-          <w:p>
-            <w:pPr>
-              <w:spacing w:after="300"/>
-              <w:jc w:val="center"/>
-            </w:pPr>
-            <w:r>
-              <w:rPr>
-                <w:i/>
-                <w:iCs/>
-                <w:color w:val="555555"/>
-                <w:sz w:val="20"/>
-                <w:szCs w:val="20"/>
-              </w:rPr>
-              <w:t xml:space="preserve">Ergebnis-Arbeitsblatt qArtikel mit gefüllten Links (Beispielwerte ggf. unkenntlich machen)</w:t>
-            </w:r>
-          </w:p>
-        </w:tc>
-      </w:tr>
-    </w:tbl>
-    <w:p>
-      <w:pPr>
-        <w:spacing w:after="60"/>
-      </w:pPr>
-      <w:r>
-        <w:t xml:space="preserve"/>
-      </w:r>
-    </w:p>
-    <w:p>
-      <w:pPr>
-        <w:pStyle w:val="Heading2"/>
-        <w:spacing w:after="100" w:before="200"/>
-      </w:pPr>
-      <w:r>
-        <w:t xml:space="preserve">Prüfen</w:t>
-      </w:r>
-    </w:p>
-    <w:p>
-      <w:pPr>
-        <w:pStyle w:val="ListParagraph"/>
-        <w:numPr>
-          <w:ilvl w:val="0"/>
-          <w:numId w:val="2"/>
-        </w:numPr>
-        <w:spacing w:after="60"/>
-      </w:pPr>
-      <w:r>
-        <w:rPr>
-          <w:b/>
-          <w:bCs/>
-        </w:rPr>
-        <w:t xml:space="preserve">Link leer: </w:t>
-      </w:r>
-      <w:r>
-        <w:t xml:space="preserve">Keine passende PDF gefunden. Ordner oder Dateiname prüfen (muss auf „z0.pdf“ enden und in 060_Zeichnungen liegen).</w:t>
-      </w:r>
-    </w:p>
-    <w:p>
-      <w:pPr>
-        <w:pStyle w:val="ListParagraph"/>
-        <w:numPr>
-          <w:ilvl w:val="0"/>
-          <w:numId w:val="2"/>
-        </w:numPr>
-        <w:spacing w:after="60"/>
-      </w:pPr>
-      <w:r>
-        <w:rPr>
-          <w:b/>
-          <w:bCs/>
-        </w:rPr>
-        <w:t xml:space="preserve">Trefferanzahl größer als 1: </w:t>
-      </w:r>
-      <w:r>
-        <w:t xml:space="preserve">Mehrere PDFs gefunden. Vorgeschlagen wird die zuletzt geänderte. Bitte kurz kontrollieren.</w:t>
-      </w:r>
-    </w:p>
-    <w:tbl>
-      <w:tblPr>
-        <w:tblW w:type="dxa" w:w="9638"/>
-        <w:tblBorders>
-          <w:top w:val="single" w:color="auto" w:sz="4"/>
-          <w:left w:val="single" w:color="auto" w:sz="4"/>
-          <w:bottom w:val="single" w:color="auto" w:sz="4"/>
-          <w:right w:val="single" w:color="auto" w:sz="4"/>
-          <w:insideH w:val="single" w:color="auto" w:sz="4"/>
-          <w:insideV w:val="single" w:color="auto" w:sz="4"/>
-        </w:tblBorders>
-      </w:tblPr>
-      <w:tblGrid>
-        <w:gridCol w:w="9638"/>
-      </w:tblGrid>
-      <w:tr>
-        <w:tc>
-          <w:tcPr>
-            <w:tcW w:type="dxa" w:w="9638"/>
-            <w:tcBorders>
-              <w:top w:val="dashed" w:color="7F7F7F" w:sz="8"/>
-              <w:left w:val="dashed" w:color="7F7F7F" w:sz="8"/>
-              <w:bottom w:val="dashed" w:color="7F7F7F" w:sz="8"/>
-              <w:right w:val="dashed" w:color="7F7F7F" w:sz="8"/>
-            </w:tcBorders>
-            <w:shd w:fill="F2F2F2" w:val="clear"/>
-            <w:tcMar>
-              <w:top w:type="dxa" w:w="120"/>
-              <w:left w:type="dxa" w:w="160"/>
-              <w:bottom w:type="dxa" w:w="120"/>
-              <w:right w:type="dxa" w:w="160"/>
-            </w:tcMar>
-          </w:tcPr>
-          <w:p>
-            <w:pPr>
-              <w:spacing w:after="60" w:before="300"/>
-              <w:jc w:val="center"/>
-            </w:pPr>
-            <w:r>
-              <w:rPr>
-                <w:b/>
-                <w:bCs/>
-                <w:color w:val="555555"/>
-              </w:rPr>
-              <w:t xml:space="preserve">[ Screenshot 20 hier einfügen ]</w:t>
-            </w:r>
-          </w:p>
-          <w:p>
-            <w:pPr>
-              <w:spacing w:after="300"/>
-              <w:jc w:val="center"/>
-            </w:pPr>
-            <w:r>
-              <w:rPr>
-                <w:i/>
-                <w:iCs/>
-                <w:color w:val="555555"/>
-                <w:sz w:val="20"/>
-                <w:szCs w:val="20"/>
-              </w:rPr>
-              <w:t xml:space="preserve">Beispielzeile mit leerem Link und Zeile mit Trefferanzahl 2 (markieren)</w:t>
-            </w:r>
-          </w:p>
-        </w:tc>
-      </w:tr>
-    </w:tbl>
-    <w:p>
-      <w:pPr>
-        <w:spacing w:after="60"/>
-      </w:pPr>
-      <w:r>
-        <w:t xml:space="preserve"/>
-      </w:r>
-    </w:p>
-    <w:p>
-      <w:pPr>
-        <w:pStyle w:val="Heading2"/>
-        <w:spacing w:after="100" w:before="200"/>
-      </w:pPr>
-      <w:r>
-        <w:t xml:space="preserve">Optional: Link klickbar machen</w:t>
-      </w:r>
-    </w:p>
-    <w:p>
-      <w:pPr>
-        <w:spacing w:after="100"/>
-      </w:pPr>
-      <w:r>
-        <w:t xml:space="preserve">Die Links sind zunächst nur Text. Für einen Klick-Link: Schreibe in die Zelle neben der Tabelle (Spalte D, erste Datenzeile) die Formel </w:t>
-      </w:r>
-      <w:r>
-        <w:rPr>
-          <w:rFonts w:ascii="Consolas" w:cs="Consolas" w:eastAsia="Consolas" w:hAnsi="Consolas"/>
-        </w:rPr>
-        <w:t xml:space="preserve">=HYPERLINK([@Zeichnung_Link];"PDF öffnen")</w:t>
-      </w:r>
-      <w:r>
-        <w:t xml:space="preserve"> und bestätige mit Enter. Excel füllt die Spalte automatisch nach unten. Mit englischem Excel ein Komma statt Semikolon verwenden.</w:t>
-      </w:r>
-    </w:p>
-    <w:tbl>
-      <w:tblPr>
-        <w:tblW w:type="dxa" w:w="9638"/>
-        <w:tblBorders>
-          <w:top w:val="single" w:color="auto" w:sz="4"/>
-          <w:left w:val="single" w:color="auto" w:sz="4"/>
-          <w:bottom w:val="single" w:color="auto" w:sz="4"/>
-          <w:right w:val="single" w:color="auto" w:sz="4"/>
-          <w:insideH w:val="single" w:color="auto" w:sz="4"/>
-          <w:insideV w:val="single" w:color="auto" w:sz="4"/>
-        </w:tblBorders>
-      </w:tblPr>
-      <w:tblGrid>
-        <w:gridCol w:w="9638"/>
-      </w:tblGrid>
-      <w:tr>
-        <w:tc>
-          <w:tcPr>
-            <w:tcW w:type="dxa" w:w="9638"/>
-            <w:tcBorders>
-              <w:top w:val="dashed" w:color="7F7F7F" w:sz="8"/>
-              <w:left w:val="dashed" w:color="7F7F7F" w:sz="8"/>
-              <w:bottom w:val="dashed" w:color="7F7F7F" w:sz="8"/>
-              <w:right w:val="dashed" w:color="7F7F7F" w:sz="8"/>
-            </w:tcBorders>
-            <w:shd w:fill="F2F2F2" w:val="clear"/>
-            <w:tcMar>
-              <w:top w:type="dxa" w:w="120"/>
-              <w:left w:type="dxa" w:w="160"/>
-              <w:bottom w:type="dxa" w:w="120"/>
-              <w:right w:type="dxa" w:w="160"/>
-            </w:tcMar>
-          </w:tcPr>
-          <w:p>
-            <w:pPr>
-              <w:spacing w:after="60" w:before="300"/>
-              <w:jc w:val="center"/>
-            </w:pPr>
-            <w:r>
-              <w:rPr>
-                <w:b/>
-                <w:bCs/>
-                <w:color w:val="555555"/>
-              </w:rPr>
-              <w:t xml:space="preserve">[ Screenshot 21 hier einfügen ]</w:t>
-            </w:r>
-          </w:p>
-          <w:p>
-            <w:pPr>
-              <w:spacing w:after="300"/>
-              <w:jc w:val="center"/>
-            </w:pPr>
-            <w:r>
-              <w:rPr>
-                <w:i/>
-                <w:iCs/>
-                <w:color w:val="555555"/>
-                <w:sz w:val="20"/>
-                <w:szCs w:val="20"/>
-              </w:rPr>
-              <w:t xml:space="preserve">Neue Spalte mit der HYPERLINK-Formel und blauen „PDF öffnen“-Links</w:t>
-            </w:r>
-          </w:p>
-        </w:tc>
-      </w:tr>
-    </w:tbl>
-    <w:p>
-      <w:pPr>
-        <w:spacing w:after="60"/>
-      </w:pPr>
-      <w:r>
-        <w:t xml:space="preserve"/>
-      </w:r>
-    </w:p>
-    <w:p>
-      <w:pPr>
-        <w:pStyle w:val="Heading2"/>
-        <w:spacing w:after="100" w:before="200"/>
-      </w:pPr>
-      <w:r>
-        <w:t xml:space="preserve">Später aktualisieren</w:t>
-      </w:r>
-    </w:p>
-    <w:p>
-      <w:pPr>
-        <w:spacing w:after="100"/>
-      </w:pPr>
-      <w:r>
-        <w:rPr>
-          <w:b/>
-          <w:bCs/>
-        </w:rPr>
-        <w:t xml:space="preserve">Daten</w:t>
-      </w:r>
-      <w:r>
-        <w:t xml:space="preserve"> → </w:t>
-      </w:r>
-      <w:r>
-        <w:rPr>
-          <w:b/>
-          <w:bCs/>
-        </w:rPr>
-        <w:t xml:space="preserve">Alle aktualisieren</w:t>
-      </w:r>
-      <w:r>
-        <w:t xml:space="preserve">. Neue Artikel in die Tabelle tblArtikel schreiben, dann aktualisieren.</w:t>
-      </w:r>
-    </w:p>
-    <w:tbl>
-      <w:tblPr>
-        <w:tblW w:type="dxa" w:w="9638"/>
-        <w:tblBorders>
-          <w:top w:val="single" w:color="auto" w:sz="4"/>
-          <w:left w:val="single" w:color="auto" w:sz="4"/>
-          <w:bottom w:val="single" w:color="auto" w:sz="4"/>
-          <w:right w:val="single" w:color="auto" w:sz="4"/>
-          <w:insideH w:val="single" w:color="auto" w:sz="4"/>
-          <w:insideV w:val="single" w:color="auto" w:sz="4"/>
-        </w:tblBorders>
-      </w:tblPr>
-      <w:tblGrid>
-        <w:gridCol w:w="9638"/>
-      </w:tblGrid>
-      <w:tr>
-        <w:tc>
-          <w:tcPr>
-            <w:tcW w:type="dxa" w:w="9638"/>
-            <w:tcBorders>
-              <w:top w:val="dashed" w:color="7F7F7F" w:sz="8"/>
-              <w:left w:val="dashed" w:color="7F7F7F" w:sz="8"/>
-              <w:bottom w:val="dashed" w:color="7F7F7F" w:sz="8"/>
-              <w:right w:val="dashed" w:color="7F7F7F" w:sz="8"/>
-            </w:tcBorders>
-            <w:shd w:fill="F2F2F2" w:val="clear"/>
-            <w:tcMar>
-              <w:top w:type="dxa" w:w="120"/>
-              <w:left w:type="dxa" w:w="160"/>
-              <w:bottom w:type="dxa" w:w="120"/>
-              <w:right w:type="dxa" w:w="160"/>
-            </w:tcMar>
-          </w:tcPr>
-          <w:p>
-            <w:pPr>
-              <w:spacing w:after="60" w:before="300"/>
-              <w:jc w:val="center"/>
-            </w:pPr>
-            <w:r>
-              <w:rPr>
-                <w:b/>
-                <w:bCs/>
-                <w:color w:val="555555"/>
-              </w:rPr>
-              <w:t xml:space="preserve">[ Screenshot 22 hier einfügen ]</w:t>
             </w:r>
           </w:p>
           <w:p>
@@ -2857,7 +2828,7 @@
                 <w:b w:val="false"/>
                 <w:bCs w:val="false"/>
               </w:rPr>
-              <w:t xml:space="preserve">Mit Organisationskonto anmelden. Bleibt es, fehlen Rechte auf der SharePoint-Seite: Zugriff beantragen.</w:t>
+              <w:t xml:space="preserve">Mit dem Microsoft-/Organisationskonto anmelden. Bleibt es, fehlen Rechte auf der SharePoint-Seite: Zugriff beantragen.</w:t>
             </w:r>
           </w:p>
         </w:tc>
@@ -3025,7 +2996,7 @@
                 <w:b w:val="false"/>
                 <w:bCs w:val="false"/>
               </w:rPr>
-              <w:t xml:space="preserve">Prüfen, ob Tabellenname und Spaltenname im Code 2 exakt stimmen und ob die PDFs auf „z0.pdf“ enden.</w:t>
+              <w:t xml:space="preserve">Prüfen, ob Tabellenname und Spaltenname im Code 2 exakt stimmen und ob die PDFs im Ordner 060_Zeichnungen liegen.</w:t>
             </w:r>
           </w:p>
         </w:tc>
@@ -3239,7 +3210,7 @@
                 <w:sz w:val="18"/>
                 <w:szCs w:val="18"/>
               </w:rPr>
-              <w:t xml:space="preserve">    Text.EndsWith(Text.Lower([Name]), "z0.pdf")),</w:t>
+              <w:t xml:space="preserve">    Text.EndsWith(Text.Lower([Name]), ".pdf")),</w:t>
             </w:r>
           </w:p>
           <w:p>

</xml_diff>